<commit_message>
miss motion-brief: cover unnumbered, body from 1 (page_number.front); latex gated, docx reported for Word's line fit (fb-595.54.51)
Co-Authored-By: Claude Opus 5.5 <noreply@anthropic.com>
</commit_message>
<xml_diff>
--- a/courts/fifth-circuit/mississippi/state/supreme-court/motion-brief/usage/OUTPUT-motion-brief.docx
+++ b/courts/fifth-circuit/mississippi/state/supreme-court/motion-brief/usage/OUTPUT-motion-brief.docx
@@ -1016,8 +1016,12 @@
     </w:tbl>
     <w:p>
       <w:pPr>
-        <w:pageBreakBefore/>
         <w:spacing w:before="0" w:after="0" w:line="1" w:lineRule="exact"/>
+        <w:sectPr>
+          <w:footerReference w:type="default" r:id="rIdXdNone"/>
+          <w:pgSz w:w="12240" w:h="15840"/>
+          <w:pgMar w:top="1440" w:right="720" w:bottom="1080" w:left="2160" w:header="720" w:footer="480" w:gutter="0"/>
+        </w:sectPr>
       </w:pPr>
     </w:p>
     <w:p>
@@ -1946,11 +1950,10 @@
       </w:tr>
     </w:tbl>
     <w:sectPr>
-      <w:footerReference w:type="default" r:id="rIdFooter1"/>
-      <w:footerReference w:type="first" r:id="rIdFooterFirst"/>
+      <w:footerReference w:type="default" r:id="rIdXdPage"/>
       <w:pgSz w:w="12240" w:h="15840"/>
       <w:pgMar w:top="1440" w:right="720" w:bottom="1080" w:left="2160" w:header="720" w:footer="480" w:gutter="0"/>
-      <w:titlePg/>
+      <w:pgNumType w:fmt="decimal" w:start="1"/>
     </w:sectPr>
   </w:body>
 </w:document>
@@ -1986,236 +1989,329 @@
 </w:ftr>
 </file>
 
-<file path=word/footer2.xml><?xml version="1.0" encoding="utf-8"?>
+<file path=word/footnotes.xml><?xml version="1.0" encoding="utf-8"?>
+<w:footnotes xmlns:w="http://schemas.openxmlformats.org/wordprocessingml/2006/main" xmlns:m="http://schemas.openxmlformats.org/officeDocument/2006/math" xmlns:r="http://schemas.openxmlformats.org/officeDocument/2006/relationships" xmlns:o="urn:schemas-microsoft-com:office:office" xmlns:v="urn:schemas-microsoft-com:vml" xmlns:w10="urn:schemas-microsoft-com:office:word" xmlns:a="http://schemas.openxmlformats.org/drawingml/2006/main" xmlns:pic="http://schemas.openxmlformats.org/drawingml/2006/picture" xmlns:wp="http://schemas.openxmlformats.org/drawingml/2006/wordprocessingDrawing">
+  <w:footnote w:type="continuationSeparator" w:id="0">
+    <w:p>
+      <w:r>
+        <w:continuationSeparator/>
+      </w:r>
+    </w:p>
+  </w:footnote>
+  <w:footnote w:type="separator" w:id="-1">
+    <w:p>
+      <w:r>
+        <w:separator/>
+      </w:r>
+    </w:p>
+  </w:footnote>
+  <w:footnote w:id="9">
+    <w:p>
+      <w:pPr>
+        <w:pStyle w:val="FootnoteText"/>
+      </w:pPr>
+      <w:r>
+        <w:rPr>
+          <w:rStyle w:val="FootnoteReference"/>
+        </w:rPr>
+        <w:footnoteRef/>
+      </w:r>
+      <w:r>
+        <w:t xml:space="preserve"> </w:t>
+      </w:r>
+      <w:r>
+        <w:t xml:space="preserve">Coronavirus Aid, Relief, and Economic Security Act, H.R. 748, 116th Cong., 2d Sess. (2020) (enacted) at Sec. 4024(b): https://​www.​congress.​gov/​bill/​116th-​congress/​house-​bill/​748</w:t>
+      </w:r>
+    </w:p>
+  </w:footnote>
+  <w:footnote w:id="10">
+    <w:p>
+      <w:pPr>
+        <w:pStyle w:val="FootnoteText"/>
+      </w:pPr>
+      <w:r>
+        <w:rPr>
+          <w:rStyle w:val="FootnoteReference"/>
+        </w:rPr>
+        <w:footnoteRef/>
+      </w:r>
+      <w:r>
+        <w:t xml:space="preserve"> </w:t>
+      </w:r>
+      <w:r>
+        <w:t xml:space="preserve">National Low Income Housing Coalition. Out of Reach 2019: Mississippi: https://​reports.​nlihc.​org/​oor/​mississippi</w:t>
+      </w:r>
+    </w:p>
+  </w:footnote>
+  <w:footnote w:id="11">
+    <w:p>
+      <w:pPr>
+        <w:pStyle w:val="FootnoteText"/>
+      </w:pPr>
+      <w:r>
+        <w:rPr>
+          <w:rStyle w:val="FootnoteReference"/>
+        </w:rPr>
+        <w:footnoteRef/>
+      </w:r>
+      <w:r>
+        <w:t xml:space="preserve"> </w:t>
+      </w:r>
+      <w:r>
+        <w:t xml:space="preserve">Mississippi Today:</w:t>
+      </w:r>
+      <w:r>
+        <w:t xml:space="preserve"> </w:t>
+      </w:r>
+      <w:r>
+        <w:t xml:space="preserve">“We are still in the eye of the storm”</w:t>
+      </w:r>
+      <w:r>
+        <w:t xml:space="preserve">: Governor Reeves extends shelter in place order, reopens lakes and beaches. Harrison, B. April 17, 2020: https://​mississippitoday.​org/​2020/​04/​17/​we-​are-​still-​in-​the-​eye-​of-​the-​storm-​reeves-​extends-​shelter-​in-​place-​order-​reopens-​lakes-​and-​beaches/</w:t>
+      </w:r>
+    </w:p>
+  </w:footnote>
+  <w:footnote w:id="12">
+    <w:p>
+      <w:pPr>
+        <w:pStyle w:val="FootnoteText"/>
+      </w:pPr>
+      <w:r>
+        <w:rPr>
+          <w:rStyle w:val="FootnoteReference"/>
+        </w:rPr>
+        <w:footnoteRef/>
+      </w:r>
+      <w:r>
+        <w:t xml:space="preserve"> </w:t>
+      </w:r>
+      <w:r>
+        <w:t xml:space="preserve">COVID</w:t>
+      </w:r>
+      <w:r>
+        <w:noBreakHyphen/>
+      </w:r>
+      <w:r>
+        <w:t xml:space="preserve">19 and unemployment in Mississippi: weekly updates. Wolfe, A. April 9, 2020: https://​mississippitoday.​org/​2020/​04/​09/​covid</w:t>
+      </w:r>
+      <w:r>
+        <w:noBreakHyphen/>
+      </w:r>
+      <w:r>
+        <w:t xml:space="preserve">19-​and-​unemployment-​in-​mississippi-​weekly-​updates/</w:t>
+      </w:r>
+    </w:p>
+  </w:footnote>
+  <w:footnote w:id="13">
+    <w:p>
+      <w:pPr>
+        <w:pStyle w:val="FootnoteText"/>
+      </w:pPr>
+      <w:r>
+        <w:rPr>
+          <w:rStyle w:val="FootnoteReference"/>
+        </w:rPr>
+        <w:footnoteRef/>
+      </w:r>
+      <w:r>
+        <w:t xml:space="preserve"> </w:t>
+      </w:r>
+      <w:r>
+        <w:t xml:space="preserve">Mississippi Today: Mississippi’s record-breaking unemployment claims spike 17,000% in two weeks of COVID</w:t>
+      </w:r>
+      <w:r>
+        <w:noBreakHyphen/>
+      </w:r>
+      <w:r>
+        <w:t xml:space="preserve">19. Wolfe, A. April 2, 2020: https://​mississippitoday.​org/​2020/​04/​02/​mississippis-​record-​breaking-​unemployment-​claims-​spike</w:t>
+      </w:r>
+      <w:r>
+        <w:noBreakHyphen/>
+      </w:r>
+      <w:r>
+        <w:t xml:space="preserve">1700-​in-​two-​weeks-​of-​covid</w:t>
+      </w:r>
+      <w:r>
+        <w:noBreakHyphen/>
+      </w:r>
+      <w:r>
+        <w:t xml:space="preserve">19/</w:t>
+      </w:r>
+    </w:p>
+  </w:footnote>
+  <w:footnote w:id="14">
+    <w:p>
+      <w:pPr>
+        <w:pStyle w:val="FootnoteText"/>
+      </w:pPr>
+      <w:r>
+        <w:rPr>
+          <w:rStyle w:val="FootnoteReference"/>
+        </w:rPr>
+        <w:footnoteRef/>
+      </w:r>
+      <w:r>
+        <w:t xml:space="preserve"> </w:t>
+      </w:r>
+      <w:r>
+        <w:t xml:space="preserve">Clarion Ledger: Mississippi loosens unemployment benefits for COVID</w:t>
+      </w:r>
+      <w:r>
+        <w:noBreakHyphen/>
+      </w:r>
+      <w:r>
+        <w:t xml:space="preserve">19. But it’s unclear who will qualify. Ramseth, L. March 23, 2020: https://​www.​clarionledger.​com/​story/​news/​2020/​03/​23/​coronavirus-​unemployment-​mississippi-​issues-​conflicting-​guidelines/​289809l001/</w:t>
+      </w:r>
+    </w:p>
+  </w:footnote>
+  <w:footnote w:id="15">
+    <w:p>
+      <w:pPr>
+        <w:pStyle w:val="FootnoteText"/>
+      </w:pPr>
+      <w:r>
+        <w:rPr>
+          <w:rStyle w:val="FootnoteReference"/>
+        </w:rPr>
+        <w:footnoteRef/>
+      </w:r>
+      <w:r>
+        <w:t xml:space="preserve"> </w:t>
+      </w:r>
+      <w:r>
+        <w:t xml:space="preserve">Sun Herald: All Mississippi Coast casinos are closing because of coronavirus pandemic. Perez, M. March 16, 2020: https://​www.​sunherald.​com/​news/​coronavirus/​article241212746.​html</w:t>
+      </w:r>
+    </w:p>
+  </w:footnote>
+  <w:footnote w:id="16">
+    <w:p>
+      <w:pPr>
+        <w:pStyle w:val="FootnoteText"/>
+      </w:pPr>
+      <w:r>
+        <w:rPr>
+          <w:rStyle w:val="FootnoteReference"/>
+        </w:rPr>
+        <w:footnoteRef/>
+      </w:r>
+      <w:r>
+        <w:t xml:space="preserve"> </w:t>
+      </w:r>
+      <w:r>
+        <w:t xml:space="preserve">Mississippi Today: Nissan Canton Plant lays off 4,000 workers to slow coronavirus spread. Wolfe, A. April 6, 2020: https://​mississippitoday.​org/​2020/​04/​06/​nissan-​canton-​plant-​lays-​off</w:t>
+      </w:r>
+      <w:r>
+        <w:noBreakHyphen/>
+      </w:r>
+      <w:r>
+        <w:t xml:space="preserve">4000-​workers-​to-​slow-​coronavirus-​spread/</w:t>
+      </w:r>
+    </w:p>
+  </w:footnote>
+</w:footnotes>
+</file>
+
+<file path=word/ftr-add.xml><?xml version="1.0" encoding="utf-8"?>
 <w:ftr xmlns:w="http://schemas.openxmlformats.org/wordprocessingml/2006/main" xmlns:r="http://schemas.openxmlformats.org/officeDocument/2006/relationships">
   <w:p>
     <w:pPr>
-      <w:spacing w:before="0" w:after="0" w:line="276" w:lineRule="exact"/>
-    </w:pPr>
+      <w:spacing w:before="0" w:after="0"/>
+      <w:jc w:val="center"/>
+    </w:pPr>
+    <w:r>
+      <w:t>Add-</w:t>
+    </w:r>
+    <w:r>
+      <w:fldChar w:fldCharType="begin"/>
+    </w:r>
+    <w:r>
+      <w:instrText xml:space="preserve"> PAGE </w:instrText>
+    </w:r>
+    <w:r>
+      <w:fldChar w:fldCharType="separate"/>
+    </w:r>
+    <w:r>
+      <w:t>1</w:t>
+    </w:r>
+    <w:r>
+      <w:fldChar w:fldCharType="end"/>
+    </w:r>
   </w:p>
 </w:ftr>
 </file>
 
-<file path=word/footnotes.xml><?xml version="1.0" encoding="utf-8"?>
-<w:footnotes xmlns:w="http://schemas.openxmlformats.org/wordprocessingml/2006/main" xmlns:m="http://schemas.openxmlformats.org/officeDocument/2006/math" xmlns:r="http://schemas.openxmlformats.org/officeDocument/2006/relationships" xmlns:o="urn:schemas-microsoft-com:office:office" xmlns:v="urn:schemas-microsoft-com:vml" xmlns:w10="urn:schemas-microsoft-com:office:word" xmlns:a="http://schemas.openxmlformats.org/drawingml/2006/main" xmlns:pic="http://schemas.openxmlformats.org/drawingml/2006/picture" xmlns:wp="http://schemas.openxmlformats.org/drawingml/2006/wordprocessingDrawing">
-  <w:footnote w:type="continuationSeparator" w:id="0">
-    <w:p>
-      <w:r>
-        <w:continuationSeparator/>
-      </w:r>
-    </w:p>
-  </w:footnote>
-  <w:footnote w:type="separator" w:id="-1">
-    <w:p>
-      <w:r>
-        <w:separator/>
-      </w:r>
-    </w:p>
-  </w:footnote>
-  <w:footnote w:id="9">
-    <w:p>
-      <w:pPr>
-        <w:pStyle w:val="FootnoteText"/>
-      </w:pPr>
-      <w:r>
-        <w:rPr>
-          <w:rStyle w:val="FootnoteReference"/>
-        </w:rPr>
-        <w:footnoteRef/>
-      </w:r>
-      <w:r>
-        <w:t xml:space="preserve"> </w:t>
-      </w:r>
-      <w:r>
-        <w:t xml:space="preserve">Coronavirus Aid, Relief, and Economic Security Act, H.R. 748, 116th Cong., 2d Sess. (2020) (enacted) at Sec. 4024(b): https://​​www.​congress.​gov/​​bill/​​116th-​congress/​​house-​bill/​​748</w:t>
-      </w:r>
-    </w:p>
-  </w:footnote>
-  <w:footnote w:id="10">
-    <w:p>
-      <w:pPr>
-        <w:pStyle w:val="FootnoteText"/>
-      </w:pPr>
-      <w:r>
-        <w:rPr>
-          <w:rStyle w:val="FootnoteReference"/>
-        </w:rPr>
-        <w:footnoteRef/>
-      </w:r>
-      <w:r>
-        <w:t xml:space="preserve"> </w:t>
-      </w:r>
-      <w:r>
-        <w:t xml:space="preserve">National Low Income Housing Coalition. Out of Reach 2019: Mississippi: https://​​reports.​nlihc.​org/​​oor/​​mississippi</w:t>
-      </w:r>
-    </w:p>
-  </w:footnote>
-  <w:footnote w:id="11">
-    <w:p>
-      <w:pPr>
-        <w:pStyle w:val="FootnoteText"/>
-      </w:pPr>
-      <w:r>
-        <w:rPr>
-          <w:rStyle w:val="FootnoteReference"/>
-        </w:rPr>
-        <w:footnoteRef/>
-      </w:r>
-      <w:r>
-        <w:t xml:space="preserve"> </w:t>
-      </w:r>
-      <w:r>
-        <w:t xml:space="preserve">Mississippi Today:</w:t>
-      </w:r>
-      <w:r>
-        <w:t xml:space="preserve"> </w:t>
-      </w:r>
-      <w:r>
-        <w:t xml:space="preserve">“We are still in the eye of the storm”</w:t>
-      </w:r>
-      <w:r>
-        <w:t xml:space="preserve">: Governor Reeves extends shelter in place order, reopens lakes and beaches. Harrison, B. April 17, 2020: https://​​mississippitoday.​org/​​2020/​​04/​​17/​​we-​are-​still-​in-​the-​eye-​of-​the-​storm-​reeves-​extends-​shelter-​in-​place-​order-​reopens-​lakes-​and-​beaches/</w:t>
-      </w:r>
-    </w:p>
-  </w:footnote>
-  <w:footnote w:id="12">
-    <w:p>
-      <w:pPr>
-        <w:pStyle w:val="FootnoteText"/>
-      </w:pPr>
-      <w:r>
-        <w:rPr>
-          <w:rStyle w:val="FootnoteReference"/>
-        </w:rPr>
-        <w:footnoteRef/>
-      </w:r>
-      <w:r>
-        <w:t xml:space="preserve"> </w:t>
-      </w:r>
-      <w:r>
-        <w:t xml:space="preserve">COVID</w:t>
-      </w:r>
-      <w:r>
-        <w:noBreakHyphen/>
-      </w:r>
-      <w:r>
-        <w:t xml:space="preserve">19 and unemployment in Mississippi: weekly updates. Wolfe, A. April 9, 2020: https://​​mississippitoday.​org/​​2020/​​04/​​09/​​covid</w:t>
-      </w:r>
-      <w:r>
-        <w:noBreakHyphen/>
-      </w:r>
-      <w:r>
-        <w:t xml:space="preserve">19-​and-​unemployment-​in-​mississippi-​weekly-​updates/</w:t>
-      </w:r>
-    </w:p>
-  </w:footnote>
-  <w:footnote w:id="13">
-    <w:p>
-      <w:pPr>
-        <w:pStyle w:val="FootnoteText"/>
-      </w:pPr>
-      <w:r>
-        <w:rPr>
-          <w:rStyle w:val="FootnoteReference"/>
-        </w:rPr>
-        <w:footnoteRef/>
-      </w:r>
-      <w:r>
-        <w:t xml:space="preserve"> </w:t>
-      </w:r>
-      <w:r>
-        <w:t xml:space="preserve">Mississippi Today: Mississippi’s record-breaking unemployment claims spike 17,000% in two weeks of COVID</w:t>
-      </w:r>
-      <w:r>
-        <w:noBreakHyphen/>
-      </w:r>
-      <w:r>
-        <w:t xml:space="preserve">19. Wolfe, A. April 2, 2020: https://​​mississippitoday.​org/​​2020/​​04/​​02/​​mississippis-​record-​breaking-​unemployment-​claims-​spike</w:t>
-      </w:r>
-      <w:r>
-        <w:noBreakHyphen/>
-      </w:r>
-      <w:r>
-        <w:t xml:space="preserve">1700-​in-​two-​weeks-​of-​covid</w:t>
-      </w:r>
-      <w:r>
-        <w:noBreakHyphen/>
-      </w:r>
-      <w:r>
-        <w:t xml:space="preserve">19/</w:t>
-      </w:r>
-    </w:p>
-  </w:footnote>
-  <w:footnote w:id="14">
-    <w:p>
-      <w:pPr>
-        <w:pStyle w:val="FootnoteText"/>
-      </w:pPr>
-      <w:r>
-        <w:rPr>
-          <w:rStyle w:val="FootnoteReference"/>
-        </w:rPr>
-        <w:footnoteRef/>
-      </w:r>
-      <w:r>
-        <w:t xml:space="preserve"> </w:t>
-      </w:r>
-      <w:r>
-        <w:t xml:space="preserve">Clarion Ledger: Mississippi loosens unemployment benefits for COVID</w:t>
-      </w:r>
-      <w:r>
-        <w:noBreakHyphen/>
-      </w:r>
-      <w:r>
-        <w:t xml:space="preserve">19. But it’s unclear who will qualify. Ramseth, L. March 23, 2020: https://​​www.​clarionledger.​com/​​story/​​news/​​2020/​​03/​​23/​​coronavirus-​unemployment-​mississippi-​issues-​conflicting-​guidelines/​​289809l001/</w:t>
-      </w:r>
-    </w:p>
-  </w:footnote>
-  <w:footnote w:id="15">
-    <w:p>
-      <w:pPr>
-        <w:pStyle w:val="FootnoteText"/>
-      </w:pPr>
-      <w:r>
-        <w:rPr>
-          <w:rStyle w:val="FootnoteReference"/>
-        </w:rPr>
-        <w:footnoteRef/>
-      </w:r>
-      <w:r>
-        <w:t xml:space="preserve"> </w:t>
-      </w:r>
-      <w:r>
-        <w:t xml:space="preserve">Sun Herald: All Mississippi Coast casinos are closing because of coronavirus pandemic. Perez, M. March 16, 2020: https://​​www.​sunherald.​com/​​news/​​coronavirus/​​article241212746.​html</w:t>
-      </w:r>
-    </w:p>
-  </w:footnote>
-  <w:footnote w:id="16">
-    <w:p>
-      <w:pPr>
-        <w:pStyle w:val="FootnoteText"/>
-      </w:pPr>
-      <w:r>
-        <w:rPr>
-          <w:rStyle w:val="FootnoteReference"/>
-        </w:rPr>
-        <w:footnoteRef/>
-      </w:r>
-      <w:r>
-        <w:t xml:space="preserve"> </w:t>
-      </w:r>
-      <w:r>
-        <w:t xml:space="preserve">Mississippi Today: Nissan Canton Plant lays off 4,000 workers to slow coronavirus spread. Wolfe, A. April 6, 2020: https://​​mississippitoday.​org/​​2020/​​04/​​06/​​nissan-​canton-​plant-​lays-​off</w:t>
-      </w:r>
-      <w:r>
-        <w:noBreakHyphen/>
-      </w:r>
-      <w:r>
-        <w:t xml:space="preserve">4000-​workers-​to-​slow-​coronavirus-​spread/</w:t>
-      </w:r>
-    </w:p>
-  </w:footnote>
-</w:footnotes>
+<file path=word/ftr-none.xml><?xml version="1.0" encoding="utf-8"?>
+<w:ftr xmlns:w="http://schemas.openxmlformats.org/wordprocessingml/2006/main" xmlns:r="http://schemas.openxmlformats.org/officeDocument/2006/relationships">
+  <w:p>
+    <w:pPr>
+      <w:spacing w:before="0" w:after="0"/>
+      <w:jc w:val="center"/>
+    </w:pPr>
+  </w:p>
+</w:ftr>
+</file>
+
+<file path=word/ftr-own1.xml><?xml version="1.0" encoding="utf-8"?>
+<w:ftr xmlns:w="http://schemas.openxmlformats.org/wordprocessingml/2006/main" xmlns:r="http://schemas.openxmlformats.org/officeDocument/2006/relationships">
+  <w:p>
+    <w:pPr>
+      <w:spacing w:before="0" w:after="0" w:line="276" w:lineRule="exact"/>
+      <w:jc w:val="center"/>
+    </w:pPr>
+    <w:r>
+      <w:fldChar w:fldCharType="begin"/>
+    </w:r>
+    <w:r>
+      <w:instrText xml:space="preserve"> PAGE </w:instrText>
+    </w:r>
+    <w:r>
+      <w:fldChar w:fldCharType="separate"/>
+    </w:r>
+    <w:r>
+      <w:t>1</w:t>
+    </w:r>
+    <w:r>
+      <w:fldChar w:fldCharType="end"/>
+    </w:r>
+  </w:p>
+</w:ftr>
+</file>
+
+<file path=word/ftr-own2.xml><?xml version="1.0" encoding="utf-8"?>
+<w:ftr xmlns:w="http://schemas.openxmlformats.org/wordprocessingml/2006/main" xmlns:r="http://schemas.openxmlformats.org/officeDocument/2006/relationships">
+  <w:p>
+    <w:pPr>
+      <w:spacing w:before="0" w:after="0" w:line="276" w:lineRule="exact"/>
+      <w:jc w:val="center"/>
+    </w:pPr>
+  </w:p>
+</w:ftr>
+</file>
+
+<file path=word/ftr-page.xml><?xml version="1.0" encoding="utf-8"?>
+<w:ftr xmlns:w="http://schemas.openxmlformats.org/wordprocessingml/2006/main" xmlns:r="http://schemas.openxmlformats.org/officeDocument/2006/relationships">
+  <w:p>
+    <w:pPr>
+      <w:spacing w:before="0" w:after="0"/>
+      <w:jc w:val="center"/>
+    </w:pPr>
+    <w:r>
+      <w:fldChar w:fldCharType="begin"/>
+    </w:r>
+    <w:r>
+      <w:instrText xml:space="preserve"> PAGE </w:instrText>
+    </w:r>
+    <w:r>
+      <w:fldChar w:fldCharType="separate"/>
+    </w:r>
+    <w:r>
+      <w:t>1</w:t>
+    </w:r>
+    <w:r>
+      <w:fldChar w:fldCharType="end"/>
+    </w:r>
+  </w:p>
+</w:ftr>
 </file>
 
 <file path=word/numbering.xml><?xml version="1.0" encoding="utf-8"?>
@@ -3101,6 +3197,33 @@
     <w:pPr>
       <w:spacing w:before="0" w:after="0" w:line="276" w:lineRule="exact"/>
       <w:ind w:left="2160" w:hanging="720"/>
+    </w:pPr>
+  </w:style>
+  <w:style w:type="paragraph" w:customStyle="1" w:styleId="XdQuoteList1">
+    <w:name w:val="Xd Quote List 1"/>
+    <w:basedOn w:val="Normal"/>
+    <w:qFormat/>
+    <w:pPr>
+      <w:spacing w:before="0" w:after="0" w:line="276" w:lineRule="exact"/>
+      <w:ind w:left="1440" w:right="720" w:hanging="720"/>
+    </w:pPr>
+  </w:style>
+  <w:style w:type="paragraph" w:customStyle="1" w:styleId="XdQuoteList2">
+    <w:name w:val="Xd Quote List 2"/>
+    <w:basedOn w:val="Normal"/>
+    <w:qFormat/>
+    <w:pPr>
+      <w:spacing w:before="0" w:after="0" w:line="276" w:lineRule="exact"/>
+      <w:ind w:left="2160" w:right="720" w:hanging="720"/>
+    </w:pPr>
+  </w:style>
+  <w:style w:type="paragraph" w:customStyle="1" w:styleId="XdQuoteList3">
+    <w:name w:val="Xd Quote List 3"/>
+    <w:basedOn w:val="Normal"/>
+    <w:qFormat/>
+    <w:pPr>
+      <w:spacing w:before="0" w:after="0" w:line="276" w:lineRule="exact"/>
+      <w:ind w:left="2880" w:right="720" w:hanging="720"/>
     </w:pPr>
   </w:style>
   <w:style w:type="paragraph" w:customStyle="1" w:styleId="SourceCode">

</xml_diff>